<commit_message>
docs(manual): add HC Office Manager -> Neural Intake section + architecture diagram
</commit_message>
<xml_diff>
--- a/TSM_Document_Processing_Revenue_Recovery_Manual_v2.0.docx
+++ b/TSM_Document_Processing_Revenue_Recovery_Manual_v2.0.docx
@@ -331,6 +331,21 @@
           <w:szCs w:val="21"/>
         </w:rPr>
         <w:t xml:space="preserve">   Healthcare</w:t>
+      </w:r>
+    </w:p>
+    <w:p>
+      <w:pPr>
+        <w:spacing w:after="100"/>
+      </w:pPr>
+      <w:r>
+        <w:rPr>
+          <w:i w:val="false"/>
+          <w:iCs w:val="false"/>
+          <w:color w:val="1A1A1A"/>
+          <w:sz w:val="21"/>
+          <w:szCs w:val="21"/>
+        </w:rPr>
+        <w:t xml:space="preserve">      HC Office Manager → Neural Intake</w:t>
       </w:r>
     </w:p>
     <w:p>
@@ -7020,6 +7035,248 @@
                 <w:szCs w:val="20"/>
               </w:rPr>
               <w:t xml:space="preserve">Denials and appeals are the core revenue-recovery loop for Healthcare — every day a denial sits unappealed is a day closer to the payer's appeal-window deadline.</w:t>
+            </w:r>
+          </w:p>
+        </w:tc>
+      </w:tr>
+    </w:tbl>
+    <w:p>
+      <w:r>
+        <w:br w:type="page"/>
+      </w:r>
+    </w:p>
+    <w:p>
+      <w:pPr>
+        <w:pStyle w:val="Heading2"/>
+        <w:spacing w:after="150" w:before="300"/>
+      </w:pPr>
+      <w:r>
+        <w:rPr>
+          <w:b/>
+          <w:bCs/>
+          <w:color w:val="1B2A4A"/>
+          <w:sz w:val="26"/>
+          <w:szCs w:val="26"/>
+        </w:rPr>
+        <w:t xml:space="preserve">HC Office Manager → Neural Intake</w:t>
+      </w:r>
+    </w:p>
+    <w:p>
+      <w:pPr>
+        <w:spacing w:after="160"/>
+      </w:pPr>
+      <w:r>
+        <w:rPr>
+          <w:b/>
+          <w:bCs/>
+          <w:sz w:val="21"/>
+          <w:szCs w:val="21"/>
+        </w:rPr>
+        <w:t xml:space="preserve">Covers: </w:t>
+      </w:r>
+      <w:r>
+        <w:rPr>
+          <w:sz w:val="21"/>
+          <w:szCs w:val="21"/>
+        </w:rPr>
+        <w:t xml:space="preserve">An additive, non-authoritative advisory-routing layer that runs alongside the primary hc-denial pipeline above. It fans a Healthcare document out to whichever additional HC domains (Compliance, Vendors, Billing, and others) it plausibly touches, without changing the exclusion-code routing described in Section 7.</w:t>
+      </w:r>
+    </w:p>
+    <w:p>
+      <w:pPr>
+        <w:spacing w:after="100"/>
+      </w:pPr>
+      <w:r>
+        <w:rPr>
+          <w:b/>
+          <w:bCs/>
+          <w:color w:val="1B2A4A"/>
+          <w:sz w:val="20"/>
+          <w:szCs w:val="20"/>
+        </w:rPr>
+        <w:t xml:space="preserve">Introduced: </w:t>
+      </w:r>
+      <w:r>
+        <w:rPr>
+          <w:color w:val="1A1A1A"/>
+          <w:sz w:val="20"/>
+          <w:szCs w:val="20"/>
+        </w:rPr>
+        <w:t xml:space="preserve">commit 7c172c77 — server/healthcare/hc-neural-intake.js, hc-node-registry.js, hc-node-contract.js; browser bridge in html/healthcare/hc-office-manager-doc-intake.html</w:t>
+      </w:r>
+    </w:p>
+    <w:p>
+      <w:pPr>
+        <w:pStyle w:val="Heading3"/>
+        <w:spacing w:after="100" w:before="200"/>
+      </w:pPr>
+      <w:r>
+        <w:rPr>
+          <w:b/>
+          <w:bCs/>
+          <w:color w:val="C0392B"/>
+          <w:sz w:val="22"/>
+          <w:szCs w:val="22"/>
+        </w:rPr>
+        <w:t xml:space="preserve">How it fits together</w:t>
+      </w:r>
+    </w:p>
+    <w:tbl>
+      <w:tblPr>
+        <w:tblW w:type="dxa" w:w="9000"/>
+        <w:tblBorders>
+          <w:top w:val="single" w:color="auto" w:sz="4"/>
+          <w:left w:val="single" w:color="auto" w:sz="4"/>
+          <w:bottom w:val="single" w:color="auto" w:sz="4"/>
+          <w:right w:val="single" w:color="auto" w:sz="4"/>
+          <w:insideH w:val="single" w:color="auto" w:sz="4"/>
+          <w:insideV w:val="single" w:color="auto" w:sz="4"/>
+        </w:tblBorders>
+      </w:tblPr>
+      <w:tblGrid>
+        <w:gridCol w:w="9000"/>
+      </w:tblGrid>
+      <w:tr>
+        <w:tc>
+          <w:tcPr>
+            <w:tcW w:type="dxa" w:w="9000"/>
+            <w:shd w:fill="F2F4F7" w:val="clear"/>
+            <w:tcMar>
+              <w:top w:type="dxa" w:w="140"/>
+              <w:left w:type="dxa" w:w="160"/>
+              <w:bottom w:type="dxa" w:w="140"/>
+              <w:right w:type="dxa" w:w="160"/>
+            </w:tcMar>
+          </w:tcPr>
+          <w:p>
+            <w:r>
+              <w:rPr>
+                <w:rFonts w:ascii="Consolas" w:hAnsi="Consolas" w:cs="Consolas"/>
+                <w:color w:val="1A1A1A"/>
+                <w:sz w:val="17"/>
+                <w:szCs w:val="17"/>
+              </w:rPr>
+              <w:t xml:space="preserve">HC OM page</w:t>
+              <w:br/>
+              <w:t xml:space="preserve">  ├─ TSM_HC_OM_NEURAL_INTAKE</w:t>
+              <w:br/>
+              <w:t xml:space="preserve">  │     └─ lazy dependency lookup</w:t>
+              <w:br/>
+              <w:t xml:space="preserve">  ├─ TSM_HC_OM_INTAKE</w:t>
+              <w:br/>
+              <w:t xml:space="preserve">  │     └─ canonical routing vocabulary</w:t>
+              <w:br/>
+              <w:t xml:space="preserve">  └─ hcOmRouteDocument()</w:t>
+              <w:br/>
+              <w:t xml:space="preserve">        └─ suggestedRoutes</w:t>
+              <w:br/>
+              <w:t xml:space="preserve">              └─ candidateNodes</w:t>
+              <w:br/>
+              <w:t xml:space="preserve">                    └─ HC Neural Intake</w:t>
+              <w:br/>
+              <w:t xml:space="preserve">                          ├─ Billing</w:t>
+              <w:br/>
+              <w:t xml:space="preserve">                          ├─ Compliance</w:t>
+              <w:br/>
+              <w:t xml:space="preserve">                          ├─ Insurance</w:t>
+              <w:br/>
+              <w:t xml:space="preserve">                          ├─ Medical</w:t>
+              <w:br/>
+              <w:t xml:space="preserve">                          ├─ Vendors</w:t>
+              <w:br/>
+              <w:t xml:space="preserve">                          └─ other registered HC nodes...</w:t>
+            </w:r>
+          </w:p>
+        </w:tc>
+      </w:tr>
+    </w:tbl>
+    <w:p>
+      <w:pPr>
+        <w:pStyle w:val="Heading3"/>
+        <w:spacing w:after="100" w:before="200"/>
+      </w:pPr>
+      <w:r>
+        <w:rPr>
+          <w:b/>
+          <w:bCs/>
+          <w:color w:val="C0392B"/>
+          <w:sz w:val="22"/>
+          <w:szCs w:val="22"/>
+        </w:rPr>
+        <w:t xml:space="preserve">How this layer is actioned today</w:t>
+      </w:r>
+    </w:p>
+    <w:p>
+      <w:pPr>
+        <w:spacing w:after="160"/>
+      </w:pPr>
+      <w:r>
+        <w:rPr>
+          <w:i w:val="false"/>
+          <w:iCs w:val="false"/>
+          <w:color w:val="1A1A1A"/>
+          <w:sz w:val="21"/>
+          <w:szCs w:val="21"/>
+        </w:rPr>
+        <w:t xml:space="preserve">Inside the uploader’s processFile(), two non-fatal try/catch blocks call TSM_HC_OM_NEURAL_INTAKE.buildEnvelope() and hcOmBuildRoutingEnvelope(). Advisory routes come from hcOmRouteDocument(), which scores document text against a per-node keyword table on TSM_HC_OM_INTAKE and returns candidates sorted by score. The server-side hc-neural-intake.js module then filters those candidates against an 11-node registry (billing, compliance, financial, grants, insurance, legal, medical, operations, pharmacy, taxprep, vendors) and builds one standardized node request per candidate via hc-node-contract.js. Findings are correlated and packaged into a Strategist-bound envelope: destination html/healthcare/hc-strategist/index.html, mode HC_CROSS_NODE_BNCA. A failure anywhere in this layer degrades to “no advisory routing this pass” — it never blocks the underlying upload or the hc-denial routing above.</w:t>
+      </w:r>
+    </w:p>
+    <w:tbl>
+      <w:tblPr>
+        <w:tblW w:type="dxa" w:w="9000"/>
+        <w:tblBorders>
+          <w:top w:val="single" w:color="auto" w:sz="4"/>
+          <w:left w:val="single" w:color="auto" w:sz="4"/>
+          <w:bottom w:val="single" w:color="auto" w:sz="4"/>
+          <w:right w:val="single" w:color="auto" w:sz="4"/>
+          <w:insideH w:val="single" w:color="auto" w:sz="4"/>
+          <w:insideV w:val="single" w:color="auto" w:sz="4"/>
+        </w:tblBorders>
+      </w:tblPr>
+      <w:tblGrid>
+        <w:gridCol w:w="9000"/>
+      </w:tblGrid>
+      <w:tr>
+        <w:tc>
+          <w:tcPr>
+            <w:tcW w:type="dxa" w:w="9000"/>
+            <w:tcBorders>
+              <w:top w:val="single" w:color="C0392B" w:sz="4"/>
+              <w:left w:val="single" w:color="C0392B" w:sz="4"/>
+              <w:bottom w:val="single" w:color="C0392B" w:sz="4"/>
+              <w:right w:val="single" w:color="C0392B" w:sz="4"/>
+            </w:tcBorders>
+            <w:shd w:fill="F2F4F7" w:val="clear"/>
+            <w:tcMar>
+              <w:top w:type="dxa" w:w="120"/>
+              <w:left w:type="dxa" w:w="160"/>
+              <w:bottom w:type="dxa" w:w="120"/>
+              <w:right w:type="dxa" w:w="160"/>
+            </w:tcMar>
+          </w:tcPr>
+          <w:p>
+            <w:pPr>
+              <w:spacing w:after="80"/>
+            </w:pPr>
+            <w:r>
+              <w:rPr>
+                <w:b/>
+                <w:bCs/>
+                <w:color w:val="C0392B"/>
+                <w:sz w:val="21"/>
+                <w:szCs w:val="21"/>
+              </w:rPr>
+              <w:t xml:space="preserve">Recovery Note</w:t>
+            </w:r>
+          </w:p>
+          <w:p>
+            <w:r>
+              <w:rPr>
+                <w:color w:val="1A1A1A"/>
+                <w:sz w:val="20"/>
+                <w:szCs w:val="20"/>
+              </w:rPr>
+              <w:t xml:space="preserve">The hc-denial exclusion-code routing (Section 7) decides where a denial or appeal goes. This layer runs in parallel and answers a different question — which other HC domains the same document also touches — so a denial with billing-compliance overlap can fan out to Compliance without waiting on a second upload or a manual re-route.</w:t>
             </w:r>
           </w:p>
         </w:tc>

</xml_diff>